<commit_message>
Auto commit (2026-10-29 17:31) — 4 changes
Claude Code 세션 종료 시 자동 커밋.

Co-Authored-By: Claude <noreply@anthropic.com>
Claude-Session: https://claude.ai/code/58f8d403-9cb2-4960-b7c3-a3241b9cf898
</commit_message>
<xml_diff>
--- a/projects/46_viking_three_wives/The Weakest Man in Rome Took Three Wives_작가 무료회차 초고(1029·1-10화)_한국어 번역본.docx
+++ b/projects/46_viking_three_wives/The Weakest Man in Rome Took Three Wives_작가 무료회차 초고(1029·1-10화)_한국어 번역본.docx
@@ -12951,7 +12951,6 @@
         <w:spacing w:before="0" w:after="0" w:line="276" w:lineRule="auto"/>
         <w:ind w:left="0" w:firstLine="0"/>
       </w:pPr>
-      <w:commentRangeStart w:id="3"/>
       <w:r>
         <w:rPr>
           <w:rFonts w:ascii="맑은 고딕" w:hAnsi="맑은 고딕" w:eastAsia="맑은 고딕"/>
@@ -12960,13 +12959,6 @@
           <w:sz w:val="21"/>
         </w:rPr>
         <w:t>[클로즈업] 엘라의 목에 눈에 띄는 키스 자국이 몇 개 나 있다.</w:t>
-      </w:r>
-      <w:commentRangeEnd w:id="3"/>
-      <w:r>
-        <w:rPr>
-          <w:rStyle w:val="CommentReference"/>
-        </w:rPr>
-        <w:commentReference w:id="3"/>
       </w:r>
     </w:p>
     <w:p>
@@ -15046,7 +15038,7 @@
         <w:spacing w:before="0" w:after="0" w:line="276" w:lineRule="auto"/>
         <w:ind w:left="0" w:firstLine="0"/>
       </w:pPr>
-      <w:commentRangeStart w:id="4"/>
+      <w:commentRangeStart w:id="3"/>
       <w:r>
         <w:rPr>
           <w:rFonts w:ascii="맑은 고딕" w:hAnsi="맑은 고딕" w:eastAsia="맑은 고딕"/>
@@ -15056,12 +15048,12 @@
         </w:rPr>
         <w:t>데이먼: (낮게) 허세 부리지 마!</w:t>
       </w:r>
-      <w:commentRangeEnd w:id="4"/>
+      <w:commentRangeEnd w:id="3"/>
       <w:r>
         <w:rPr>
           <w:rStyle w:val="CommentReference"/>
         </w:rPr>
-        <w:commentReference w:id="4"/>
+        <w:commentReference w:id="3"/>
       </w:r>
     </w:p>
     <w:p>
@@ -15562,7 +15554,7 @@
 
 <file path=word/comments.xml><?xml version="1.0" encoding="utf-8"?>
 <w:comments xmlns:a="http://schemas.openxmlformats.org/drawingml/2006/main" xmlns:pic="http://schemas.openxmlformats.org/drawingml/2006/picture" xmlns:r="http://schemas.openxmlformats.org/officeDocument/2006/relationships" xmlns:w="http://schemas.openxmlformats.org/wordprocessingml/2006/main" xmlns:wp="http://schemas.openxmlformats.org/drawingml/2006/wordprocessingDrawing" xmlns:mc="http://schemas.openxmlformats.org/markup-compatibility/2006" xmlns:a14="http://schemas.microsoft.com/office/drawing/2010/main" xmlns:w14="http://schemas.microsoft.com/office/word/2010/wordml" xmlns:wpc="http://schemas.microsoft.com/office/word/2010/wordprocessingCanvas">
-  <w:comment w:id="0" w:author="검토" w:initials="검" w:date="2026-10-29T08:15:09Z">
+  <w:comment w:id="0" w:author="검토" w:initials="검" w:date="2026-10-29T08:30:45Z">
     <w:p>
       <w:pPr>
         <w:pStyle w:val="CommentText"/>
@@ -15586,7 +15578,7 @@
       </w:r>
     </w:p>
   </w:comment>
-  <w:comment w:id="1" w:author="검토" w:initials="검" w:date="2026-10-29T08:15:09Z">
+  <w:comment w:id="1" w:author="검토" w:initials="검" w:date="2026-10-29T08:30:45Z">
     <w:p>
       <w:pPr>
         <w:pStyle w:val="CommentText"/>
@@ -15610,7 +15602,7 @@
       </w:r>
     </w:p>
   </w:comment>
-  <w:comment w:id="2" w:author="검토" w:initials="검" w:date="2026-10-29T08:15:09Z">
+  <w:comment w:id="2" w:author="검토" w:initials="검" w:date="2026-10-29T08:30:45Z">
     <w:p>
       <w:pPr>
         <w:pStyle w:val="CommentText"/>
@@ -15634,31 +15626,7 @@
       </w:r>
     </w:p>
   </w:comment>
-  <w:comment w:id="3" w:author="검토" w:initials="검" w:date="2026-10-29T08:15:09Z">
-    <w:p>
-      <w:pPr>
-        <w:pStyle w:val="CommentText"/>
-      </w:pPr>
-      <w:r>
-        <w:rPr>
-          <w:rStyle w:val="CommentReference"/>
-        </w:rPr>
-        <w:annotationRef/>
-      </w:r>
-      <w:r>
-        <w:t>[연결] 8화에서 목에 입을 맞춘 건 엘라고(301·302줄 「吻在了他的脖子上」), 에릭은 엘라의 가슴께에만 입을 맞췄어요(310줄). 그런데 여기선 엘라 목에 키스 자국이 클로즈업으로 나와요.</w:t>
-      </w:r>
-    </w:p>
-    <w:p>
-      <w:pPr>
-        <w:pStyle w:val="CommentText"/>
-      </w:pPr>
-      <w:r>
-        <w:t>[고칠 줄] 310줄 △埃里克坐起身抱住了艾拉，在她的脖颈和胸前未被衣物覆盖的皮肤上胡乱吻着。</w:t>
-      </w:r>
-    </w:p>
-  </w:comment>
-  <w:comment w:id="4" w:author="검토" w:initials="검" w:date="2026-10-29T08:15:09Z">
+  <w:comment w:id="3" w:author="검토" w:initials="검" w:date="2026-10-29T08:30:45Z">
     <w:p>
       <w:pPr>
         <w:pStyle w:val="CommentText"/>

</xml_diff>

<commit_message>
Auto commit (2026-10-29 17:37) — 4 changes
Claude Code 세션 종료 시 자동 커밋.

Co-Authored-By: Claude <noreply@anthropic.com>
</commit_message>
<xml_diff>
--- a/projects/46_viking_three_wives/The Weakest Man in Rome Took Three Wives_작가 무료회차 초고(1029·1-10화)_한국어 번역본.docx
+++ b/projects/46_viking_three_wives/The Weakest Man in Rome Took Three Wives_작가 무료회차 초고(1029·1-10화)_한국어 번역본.docx
@@ -12951,6 +12951,7 @@
         <w:spacing w:before="0" w:after="0" w:line="276" w:lineRule="auto"/>
         <w:ind w:left="0" w:firstLine="0"/>
       </w:pPr>
+      <w:commentRangeStart w:id="3"/>
       <w:r>
         <w:rPr>
           <w:rFonts w:ascii="맑은 고딕" w:hAnsi="맑은 고딕" w:eastAsia="맑은 고딕"/>
@@ -12959,6 +12960,13 @@
           <w:sz w:val="21"/>
         </w:rPr>
         <w:t>[클로즈업] 엘라의 목에 눈에 띄는 키스 자국이 몇 개 나 있다.</w:t>
+      </w:r>
+      <w:commentRangeEnd w:id="3"/>
+      <w:r>
+        <w:rPr>
+          <w:rStyle w:val="CommentReference"/>
+        </w:rPr>
+        <w:commentReference w:id="3"/>
       </w:r>
     </w:p>
     <w:p>
@@ -15038,7 +15046,7 @@
         <w:spacing w:before="0" w:after="0" w:line="276" w:lineRule="auto"/>
         <w:ind w:left="0" w:firstLine="0"/>
       </w:pPr>
-      <w:commentRangeStart w:id="3"/>
+      <w:commentRangeStart w:id="4"/>
       <w:r>
         <w:rPr>
           <w:rFonts w:ascii="맑은 고딕" w:hAnsi="맑은 고딕" w:eastAsia="맑은 고딕"/>
@@ -15048,12 +15056,12 @@
         </w:rPr>
         <w:t>데이먼: (낮게) 허세 부리지 마!</w:t>
       </w:r>
-      <w:commentRangeEnd w:id="3"/>
+      <w:commentRangeEnd w:id="4"/>
       <w:r>
         <w:rPr>
           <w:rStyle w:val="CommentReference"/>
         </w:rPr>
-        <w:commentReference w:id="3"/>
+        <w:commentReference w:id="4"/>
       </w:r>
     </w:p>
     <w:p>
@@ -15554,7 +15562,7 @@
 
 <file path=word/comments.xml><?xml version="1.0" encoding="utf-8"?>
 <w:comments xmlns:a="http://schemas.openxmlformats.org/drawingml/2006/main" xmlns:pic="http://schemas.openxmlformats.org/drawingml/2006/picture" xmlns:r="http://schemas.openxmlformats.org/officeDocument/2006/relationships" xmlns:w="http://schemas.openxmlformats.org/wordprocessingml/2006/main" xmlns:wp="http://schemas.openxmlformats.org/drawingml/2006/wordprocessingDrawing" xmlns:mc="http://schemas.openxmlformats.org/markup-compatibility/2006" xmlns:a14="http://schemas.microsoft.com/office/drawing/2010/main" xmlns:w14="http://schemas.microsoft.com/office/word/2010/wordml" xmlns:wpc="http://schemas.microsoft.com/office/word/2010/wordprocessingCanvas">
-  <w:comment w:id="0" w:author="검토" w:initials="검" w:date="2026-10-29T08:30:45Z">
+  <w:comment w:id="0" w:author="검토" w:initials="검" w:date="2026-10-29T08:36:34Z">
     <w:p>
       <w:pPr>
         <w:pStyle w:val="CommentText"/>
@@ -15578,7 +15586,7 @@
       </w:r>
     </w:p>
   </w:comment>
-  <w:comment w:id="1" w:author="검토" w:initials="검" w:date="2026-10-29T08:30:45Z">
+  <w:comment w:id="1" w:author="검토" w:initials="검" w:date="2026-10-29T08:36:34Z">
     <w:p>
       <w:pPr>
         <w:pStyle w:val="CommentText"/>
@@ -15602,7 +15610,7 @@
       </w:r>
     </w:p>
   </w:comment>
-  <w:comment w:id="2" w:author="검토" w:initials="검" w:date="2026-10-29T08:30:45Z">
+  <w:comment w:id="2" w:author="검토" w:initials="검" w:date="2026-10-29T08:36:34Z">
     <w:p>
       <w:pPr>
         <w:pStyle w:val="CommentText"/>
@@ -15626,7 +15634,31 @@
       </w:r>
     </w:p>
   </w:comment>
-  <w:comment w:id="3" w:author="검토" w:initials="검" w:date="2026-10-29T08:30:45Z">
+  <w:comment w:id="3" w:author="검토" w:initials="검" w:date="2026-10-29T08:36:34Z">
+    <w:p>
+      <w:pPr>
+        <w:pStyle w:val="CommentText"/>
+      </w:pPr>
+      <w:r>
+        <w:rPr>
+          <w:rStyle w:val="CommentReference"/>
+        </w:rPr>
+        <w:annotationRef/>
+      </w:r>
+      <w:r>
+        <w:t>[연결] 8화에서 목에 입을 맞춘 건 엘라고(301·302줄 「吻在了他的脖子上」), 에릭은 엘라의 가슴께에만 입을 맞췄어요(310줄). 8화 끝과 9화 첫 장면이 몇 초 차로 이어지는데 여기선 엘라 목에 키스 자국이 클로즈업으로 나와요.</w:t>
+      </w:r>
+    </w:p>
+    <w:p>
+      <w:pPr>
+        <w:pStyle w:val="CommentText"/>
+      </w:pPr>
+      <w:r>
+        <w:t>[고칠 줄] 310줄 △埃里克坐起身抱住了艾拉，在她的脖颈和胸前未被衣物覆盖的皮肤上胡乱吻着。</w:t>
+      </w:r>
+    </w:p>
+  </w:comment>
+  <w:comment w:id="4" w:author="검토" w:initials="검" w:date="2026-10-29T08:36:34Z">
     <w:p>
       <w:pPr>
         <w:pStyle w:val="CommentText"/>

</xml_diff>